<commit_message>
Corregir Capitulo V final segun observaciones: hashing de contrasenas, trazabilidad de validacion (RF-01/RF-03), matriz de diseno con todos los RNF y referencias de figuras consistentes
- Seguridad: las contrasenas se describen como almacenadas mediante hashing (bcrypt), no cifradas.
- Se corrige la correspondencia de cada mecanismo con su requerimiento; validacion de entradas deja de mapearse a RNF-10.
- La matriz de trazabilidad del diseno contempla los 10 RF y los 15 RNF.
- Referencias de figuras uniformes (Figura N).

Co-Authored-By: Claude Opus 4.8 <noreply@anthropic.com>
Claude-Session: https://claude.ai/code/session_01Sm38z3hKHEsA4NBw2brVKF
</commit_message>
<xml_diff>
--- a/P8-Capitulo V - FINAL (completo).docx
+++ b/P8-Capitulo V - FINAL (completo).docx
@@ -4733,7 +4733,7 @@
           <w:sz w:val="24"/>
           <w:szCs w:val="24"/>
         </w:rPr>
-        <w:t xml:space="preserve">El diseño de seguridad define los mecanismos que protegen la información y controlan el acceso al sistema. La comunicación entre el cliente y el servidor se realiza sobre HTTPS; en el servidor se aplican la autenticación mediante tokens, el control de acceso basado en roles, la validación de las entradas y el registro de las transacciones en bitácora. En la base de datos, las contraseñas se almacenan cifradas y la información se protege mediante respaldos periódicos. Estos mecanismos dan respuesta a los requerimientos no funcionales de seguridad y trazabilidad definidos en el Capítulo IV.</w:t>
+        <w:t xml:space="preserve">El diseño de seguridad define los mecanismos que protegen la información y controlan el acceso al sistema. La comunicación entre el cliente y el servidor se realiza sobre HTTPS; en el servidor se aplican la autenticación mediante tokens, el control de acceso basado en roles, la validación de las entradas y el registro de las transacciones en bitácora. En la base de datos, las contraseñas se almacenan mediante hashing con el algoritmo bcrypt —es decir, no se guardan ni en texto plano ni cifradas de forma reversible— y la información se protege mediante respaldos periódicos. Estos mecanismos dan respuesta a los requerimientos no funcionales de seguridad y trazabilidad definidos en el Capítulo IV.</w:t>
       </w:r>
     </w:p>
     <w:p>
@@ -4898,7 +4898,7 @@
           <w:sz w:val="22"/>
           <w:szCs w:val="22"/>
         </w:rPr>
-        <w:t xml:space="preserve">La tabla describe los mecanismos de seguridad de la solución y el requerimiento no funcional que atiende cada uno.</w:t>
+        <w:t xml:space="preserve">La tabla describe los mecanismos de seguridad de la solución y el requerimiento que atiende cada uno.</w:t>
       </w:r>
     </w:p>
     <w:tbl>
@@ -4915,9 +4915,9 @@
         <w:tblLayout w:type="fixed"/>
       </w:tblPr>
       <w:tblGrid>
-        <w:gridCol w:w="2500"/>
-        <w:gridCol w:w="5560"/>
-        <w:gridCol w:w="1300"/>
+        <w:gridCol w:w="2650"/>
+        <w:gridCol w:w="5010"/>
+        <w:gridCol w:w="1700"/>
       </w:tblGrid>
       <w:tr>
         <w:trPr>
@@ -4925,7 +4925,7 @@
         </w:trPr>
         <w:tc>
           <w:tcPr>
-            <w:tcW w:type="dxa" w:w="2500"/>
+            <w:tcW w:type="dxa" w:w="2650"/>
             <w:shd w:fill="D9D9D9" w:color="auto" w:val="clear"/>
             <w:tcMar>
               <w:top w:type="dxa" w:w="30"/>
@@ -4954,7 +4954,7 @@
         </w:tc>
         <w:tc>
           <w:tcPr>
-            <w:tcW w:type="dxa" w:w="5560"/>
+            <w:tcW w:type="dxa" w:w="5010"/>
             <w:shd w:fill="D9D9D9" w:color="auto" w:val="clear"/>
             <w:tcMar>
               <w:top w:type="dxa" w:w="30"/>
@@ -4983,7 +4983,7 @@
         </w:tc>
         <w:tc>
           <w:tcPr>
-            <w:tcW w:type="dxa" w:w="1300"/>
+            <w:tcW w:type="dxa" w:w="1700"/>
             <w:shd w:fill="D9D9D9" w:color="auto" w:val="clear"/>
             <w:tcMar>
               <w:top w:type="dxa" w:w="30"/>
@@ -5006,7 +5006,7 @@
                 <w:sz w:val="19"/>
                 <w:szCs w:val="19"/>
               </w:rPr>
-              <w:t xml:space="preserve">RNF</w:t>
+              <w:t xml:space="preserve">Requerimiento asociado</w:t>
             </w:r>
           </w:p>
         </w:tc>
@@ -5014,7 +5014,7 @@
       <w:tr>
         <w:tc>
           <w:tcPr>
-            <w:tcW w:type="dxa" w:w="2500"/>
+            <w:tcW w:type="dxa" w:w="2650"/>
             <w:tcMar>
               <w:top w:type="dxa" w:w="30"/>
               <w:left w:type="dxa" w:w="70"/>
@@ -5040,7 +5040,7 @@
         </w:tc>
         <w:tc>
           <w:tcPr>
-            <w:tcW w:type="dxa" w:w="5560"/>
+            <w:tcW w:type="dxa" w:w="5010"/>
             <w:tcMar>
               <w:top w:type="dxa" w:w="30"/>
               <w:left w:type="dxa" w:w="70"/>
@@ -5066,7 +5066,7 @@
         </w:tc>
         <w:tc>
           <w:tcPr>
-            <w:tcW w:type="dxa" w:w="1300"/>
+            <w:tcW w:type="dxa" w:w="1700"/>
             <w:tcMar>
               <w:top w:type="dxa" w:w="30"/>
               <w:left w:type="dxa" w:w="70"/>
@@ -5094,7 +5094,7 @@
       <w:tr>
         <w:tc>
           <w:tcPr>
-            <w:tcW w:type="dxa" w:w="2500"/>
+            <w:tcW w:type="dxa" w:w="2650"/>
             <w:shd w:fill="F2F2F2" w:color="auto" w:val="clear"/>
             <w:tcMar>
               <w:top w:type="dxa" w:w="30"/>
@@ -5115,13 +5115,13 @@
                 <w:sz w:val="19"/>
                 <w:szCs w:val="19"/>
               </w:rPr>
-              <w:t xml:space="preserve">Cifrado de contraseñas</w:t>
-            </w:r>
-          </w:p>
-        </w:tc>
-        <w:tc>
-          <w:tcPr>
-            <w:tcW w:type="dxa" w:w="5560"/>
+              <w:t xml:space="preserve">Hashing de contraseñas (bcrypt)</w:t>
+            </w:r>
+          </w:p>
+        </w:tc>
+        <w:tc>
+          <w:tcPr>
+            <w:tcW w:type="dxa" w:w="5010"/>
             <w:shd w:fill="F2F2F2" w:color="auto" w:val="clear"/>
             <w:tcMar>
               <w:top w:type="dxa" w:w="30"/>
@@ -5142,13 +5142,13 @@
                 <w:sz w:val="19"/>
                 <w:szCs w:val="19"/>
               </w:rPr>
-              <w:t xml:space="preserve">Las contraseñas se almacenan mediante un algoritmo de hashing (bcrypt).</w:t>
-            </w:r>
-          </w:p>
-        </w:tc>
-        <w:tc>
-          <w:tcPr>
-            <w:tcW w:type="dxa" w:w="1300"/>
+              <w:t xml:space="preserve">Las contraseñas se almacenan mediante hashing con bcrypt; no se guardan en texto plano.</w:t>
+            </w:r>
+          </w:p>
+        </w:tc>
+        <w:tc>
+          <w:tcPr>
+            <w:tcW w:type="dxa" w:w="1700"/>
             <w:shd w:fill="F2F2F2" w:color="auto" w:val="clear"/>
             <w:tcMar>
               <w:top w:type="dxa" w:w="30"/>
@@ -5177,33 +5177,33 @@
       <w:tr>
         <w:tc>
           <w:tcPr>
-            <w:tcW w:type="dxa" w:w="2500"/>
-            <w:tcMar>
-              <w:top w:type="dxa" w:w="30"/>
-              <w:left w:type="dxa" w:w="70"/>
-              <w:bottom w:type="dxa" w:w="30"/>
-              <w:right w:type="dxa" w:w="70"/>
-            </w:tcMar>
-            <w:vAlign w:val="center"/>
-          </w:tcPr>
-          <w:p>
-            <w:pPr>
-              <w:spacing w:after="20" w:line="240"/>
-              <w:jc w:val="left"/>
-            </w:pPr>
-            <w:r>
-              <w:rPr>
-                <w:rFonts w:ascii="Times New Roman" w:cs="Times New Roman" w:eastAsia="Times New Roman" w:hAnsi="Times New Roman"/>
-                <w:sz w:val="19"/>
-                <w:szCs w:val="19"/>
-              </w:rPr>
-              <w:t xml:space="preserve">Autenticación por token</w:t>
-            </w:r>
-          </w:p>
-        </w:tc>
-        <w:tc>
-          <w:tcPr>
-            <w:tcW w:type="dxa" w:w="5560"/>
+            <w:tcW w:type="dxa" w:w="2650"/>
+            <w:tcMar>
+              <w:top w:type="dxa" w:w="30"/>
+              <w:left w:type="dxa" w:w="70"/>
+              <w:bottom w:type="dxa" w:w="30"/>
+              <w:right w:type="dxa" w:w="70"/>
+            </w:tcMar>
+            <w:vAlign w:val="center"/>
+          </w:tcPr>
+          <w:p>
+            <w:pPr>
+              <w:spacing w:after="20" w:line="240"/>
+              <w:jc w:val="left"/>
+            </w:pPr>
+            <w:r>
+              <w:rPr>
+                <w:rFonts w:ascii="Times New Roman" w:cs="Times New Roman" w:eastAsia="Times New Roman" w:hAnsi="Times New Roman"/>
+                <w:sz w:val="19"/>
+                <w:szCs w:val="19"/>
+              </w:rPr>
+              <w:t xml:space="preserve">Autenticación mediante token (JWT)</w:t>
+            </w:r>
+          </w:p>
+        </w:tc>
+        <w:tc>
+          <w:tcPr>
+            <w:tcW w:type="dxa" w:w="5010"/>
             <w:tcMar>
               <w:top w:type="dxa" w:w="30"/>
               <w:left w:type="dxa" w:w="70"/>
@@ -5229,7 +5229,7 @@
         </w:tc>
         <w:tc>
           <w:tcPr>
-            <w:tcW w:type="dxa" w:w="1300"/>
+            <w:tcW w:type="dxa" w:w="1700"/>
             <w:tcMar>
               <w:top w:type="dxa" w:w="30"/>
               <w:left w:type="dxa" w:w="70"/>
@@ -5249,7 +5249,7 @@
                 <w:sz w:val="19"/>
                 <w:szCs w:val="19"/>
               </w:rPr>
-              <w:t xml:space="preserve">RNF-02</w:t>
+              <w:t xml:space="preserve">RF-08</w:t>
             </w:r>
           </w:p>
         </w:tc>
@@ -5257,7 +5257,7 @@
       <w:tr>
         <w:tc>
           <w:tcPr>
-            <w:tcW w:type="dxa" w:w="2500"/>
+            <w:tcW w:type="dxa" w:w="2650"/>
             <w:shd w:fill="F2F2F2" w:color="auto" w:val="clear"/>
             <w:tcMar>
               <w:top w:type="dxa" w:w="30"/>
@@ -5278,13 +5278,13 @@
                 <w:sz w:val="19"/>
                 <w:szCs w:val="19"/>
               </w:rPr>
-              <w:t xml:space="preserve">Control de acceso por rol</w:t>
-            </w:r>
-          </w:p>
-        </w:tc>
-        <w:tc>
-          <w:tcPr>
-            <w:tcW w:type="dxa" w:w="5560"/>
+              <w:t xml:space="preserve">Control de acceso basado en roles (RBAC)</w:t>
+            </w:r>
+          </w:p>
+        </w:tc>
+        <w:tc>
+          <w:tcPr>
+            <w:tcW w:type="dxa" w:w="5010"/>
             <w:shd w:fill="F2F2F2" w:color="auto" w:val="clear"/>
             <w:tcMar>
               <w:top w:type="dxa" w:w="30"/>
@@ -5305,13 +5305,13 @@
                 <w:sz w:val="19"/>
                 <w:szCs w:val="19"/>
               </w:rPr>
-              <w:t xml:space="preserve">Cada rol accede únicamente a las funciones autorizadas (RBAC).</w:t>
-            </w:r>
-          </w:p>
-        </w:tc>
-        <w:tc>
-          <w:tcPr>
-            <w:tcW w:type="dxa" w:w="1300"/>
+              <w:t xml:space="preserve">Cada rol accede únicamente a las funciones autorizadas.</w:t>
+            </w:r>
+          </w:p>
+        </w:tc>
+        <w:tc>
+          <w:tcPr>
+            <w:tcW w:type="dxa" w:w="1700"/>
             <w:shd w:fill="F2F2F2" w:color="auto" w:val="clear"/>
             <w:tcMar>
               <w:top w:type="dxa" w:w="30"/>
@@ -5340,7 +5340,7 @@
       <w:tr>
         <w:tc>
           <w:tcPr>
-            <w:tcW w:type="dxa" w:w="2500"/>
+            <w:tcW w:type="dxa" w:w="2650"/>
             <w:tcMar>
               <w:top w:type="dxa" w:w="30"/>
               <w:left w:type="dxa" w:w="70"/>
@@ -5366,7 +5366,7 @@
         </w:tc>
         <w:tc>
           <w:tcPr>
-            <w:tcW w:type="dxa" w:w="5560"/>
+            <w:tcW w:type="dxa" w:w="5010"/>
             <w:tcMar>
               <w:top w:type="dxa" w:w="30"/>
               <w:left w:type="dxa" w:w="70"/>
@@ -5392,7 +5392,7 @@
         </w:tc>
         <w:tc>
           <w:tcPr>
-            <w:tcW w:type="dxa" w:w="1300"/>
+            <w:tcW w:type="dxa" w:w="1700"/>
             <w:tcMar>
               <w:top w:type="dxa" w:w="30"/>
               <w:left w:type="dxa" w:w="70"/>
@@ -5420,7 +5420,7 @@
       <w:tr>
         <w:tc>
           <w:tcPr>
-            <w:tcW w:type="dxa" w:w="2500"/>
+            <w:tcW w:type="dxa" w:w="2650"/>
             <w:shd w:fill="F2F2F2" w:color="auto" w:val="clear"/>
             <w:tcMar>
               <w:top w:type="dxa" w:w="30"/>
@@ -5447,7 +5447,7 @@
         </w:tc>
         <w:tc>
           <w:tcPr>
-            <w:tcW w:type="dxa" w:w="5560"/>
+            <w:tcW w:type="dxa" w:w="5010"/>
             <w:shd w:fill="F2F2F2" w:color="auto" w:val="clear"/>
             <w:tcMar>
               <w:top w:type="dxa" w:w="30"/>
@@ -5468,13 +5468,13 @@
                 <w:sz w:val="19"/>
                 <w:szCs w:val="19"/>
               </w:rPr>
-              <w:t xml:space="preserve">El sistema valida los datos recibidos antes de procesarlos.</w:t>
-            </w:r>
-          </w:p>
-        </w:tc>
-        <w:tc>
-          <w:tcPr>
-            <w:tcW w:type="dxa" w:w="1300"/>
+              <w:t xml:space="preserve">El sistema valida los datos recibidos antes de procesarlos, como control preventivo de seguridad e integridad.</w:t>
+            </w:r>
+          </w:p>
+        </w:tc>
+        <w:tc>
+          <w:tcPr>
+            <w:tcW w:type="dxa" w:w="1700"/>
             <w:shd w:fill="F2F2F2" w:color="auto" w:val="clear"/>
             <w:tcMar>
               <w:top w:type="dxa" w:w="30"/>
@@ -5495,7 +5495,7 @@
                 <w:sz w:val="19"/>
                 <w:szCs w:val="19"/>
               </w:rPr>
-              <w:t xml:space="preserve">RNF-10</w:t>
+              <w:t xml:space="preserve">RF-01, RF-03</w:t>
             </w:r>
           </w:p>
         </w:tc>
@@ -5503,7 +5503,7 @@
       <w:tr>
         <w:tc>
           <w:tcPr>
-            <w:tcW w:type="dxa" w:w="2500"/>
+            <w:tcW w:type="dxa" w:w="2650"/>
             <w:tcMar>
               <w:top w:type="dxa" w:w="30"/>
               <w:left w:type="dxa" w:w="70"/>
@@ -5529,7 +5529,7 @@
         </w:tc>
         <w:tc>
           <w:tcPr>
-            <w:tcW w:type="dxa" w:w="5560"/>
+            <w:tcW w:type="dxa" w:w="5010"/>
             <w:tcMar>
               <w:top w:type="dxa" w:w="30"/>
               <w:left w:type="dxa" w:w="70"/>
@@ -5555,7 +5555,7 @@
         </w:tc>
         <w:tc>
           <w:tcPr>
-            <w:tcW w:type="dxa" w:w="1300"/>
+            <w:tcW w:type="dxa" w:w="1700"/>
             <w:tcMar>
               <w:top w:type="dxa" w:w="30"/>
               <w:left w:type="dxa" w:w="70"/>
@@ -5583,7 +5583,7 @@
       <w:tr>
         <w:tc>
           <w:tcPr>
-            <w:tcW w:type="dxa" w:w="2500"/>
+            <w:tcW w:type="dxa" w:w="2650"/>
             <w:shd w:fill="F2F2F2" w:color="auto" w:val="clear"/>
             <w:tcMar>
               <w:top w:type="dxa" w:w="30"/>
@@ -5610,7 +5610,7 @@
         </w:tc>
         <w:tc>
           <w:tcPr>
-            <w:tcW w:type="dxa" w:w="5560"/>
+            <w:tcW w:type="dxa" w:w="5010"/>
             <w:shd w:fill="F2F2F2" w:color="auto" w:val="clear"/>
             <w:tcMar>
               <w:top w:type="dxa" w:w="30"/>
@@ -5637,7 +5637,7 @@
         </w:tc>
         <w:tc>
           <w:tcPr>
-            <w:tcW w:type="dxa" w:w="1300"/>
+            <w:tcW w:type="dxa" w:w="1700"/>
             <w:shd w:fill="F2F2F2" w:color="auto" w:val="clear"/>
             <w:tcMar>
               <w:top w:type="dxa" w:w="30"/>
@@ -7057,7 +7057,7 @@
           <w:sz w:val="24"/>
           <w:szCs w:val="24"/>
         </w:rPr>
-        <w:t xml:space="preserve">La matriz de trazabilidad del diseño relaciona los requerimientos y casos de uso con los elementos de diseño que les dan respuesta, tales como los diagramas, los componentes, las interfaces y los mecanismos de seguridad. De esta manera se comprueba que cada requerimiento del Capítulo IV se encuentra representado en el diseño de la solución y se conserva la coherencia entre ambos capítulos.</w:t>
+        <w:t xml:space="preserve">La matriz de trazabilidad del diseño relaciona los requerimientos con los elementos de diseño que les dan respuesta, tales como los diagramas, los componentes, las interfaces y los mecanismos de seguridad. Con el propósito de garantizar una cobertura completa, se contemplan la totalidad de los requerimientos funcionales (RF-01 a RF-10) y no funcionales (RNF-01 a RNF-15) definidos en el Capítulo IV, de modo que quede claro qué elemento de diseño responde a cada uno de ellos y se conserve la coherencia entre ambos capítulos.</w:t>
       </w:r>
     </w:p>
     <w:p>
@@ -7102,7 +7102,7 @@
           <w:sz w:val="22"/>
           <w:szCs w:val="22"/>
         </w:rPr>
-        <w:t xml:space="preserve">La tabla vincula cada requerimiento y caso de uso con los elementos de diseño que lo materializan.</w:t>
+        <w:t xml:space="preserve">La tabla vincula cada requerimiento funcional y no funcional con el atributo o caso de uso asociado y con los elementos de diseño que lo materializan.</w:t>
       </w:r>
     </w:p>
     <w:tbl>
@@ -7119,9 +7119,9 @@
         <w:tblLayout w:type="fixed"/>
       </w:tblPr>
       <w:tblGrid>
-        <w:gridCol w:w="2100"/>
-        <w:gridCol w:w="2760"/>
-        <w:gridCol w:w="4500"/>
+        <w:gridCol w:w="1550"/>
+        <w:gridCol w:w="2560"/>
+        <w:gridCol w:w="5250"/>
       </w:tblGrid>
       <w:tr>
         <w:trPr>
@@ -7129,7 +7129,7 @@
         </w:trPr>
         <w:tc>
           <w:tcPr>
-            <w:tcW w:type="dxa" w:w="2100"/>
+            <w:tcW w:type="dxa" w:w="1550"/>
             <w:shd w:fill="D9D9D9" w:color="auto" w:val="clear"/>
             <w:tcMar>
               <w:top w:type="dxa" w:w="30"/>
@@ -7158,7 +7158,7 @@
         </w:tc>
         <w:tc>
           <w:tcPr>
-            <w:tcW w:type="dxa" w:w="2760"/>
+            <w:tcW w:type="dxa" w:w="2560"/>
             <w:shd w:fill="D9D9D9" w:color="auto" w:val="clear"/>
             <w:tcMar>
               <w:top w:type="dxa" w:w="30"/>
@@ -7181,13 +7181,13 @@
                 <w:sz w:val="19"/>
                 <w:szCs w:val="19"/>
               </w:rPr>
-              <w:t xml:space="preserve">Caso de uso</w:t>
-            </w:r>
-          </w:p>
-        </w:tc>
-        <w:tc>
-          <w:tcPr>
-            <w:tcW w:type="dxa" w:w="4500"/>
+              <w:t xml:space="preserve">Atributo / Caso de uso</w:t>
+            </w:r>
+          </w:p>
+        </w:tc>
+        <w:tc>
+          <w:tcPr>
+            <w:tcW w:type="dxa" w:w="5250"/>
             <w:shd w:fill="D9D9D9" w:color="auto" w:val="clear"/>
             <w:tcMar>
               <w:top w:type="dxa" w:w="30"/>
@@ -7210,7 +7210,7 @@
                 <w:sz w:val="19"/>
                 <w:szCs w:val="19"/>
               </w:rPr>
-              <w:t xml:space="preserve">Elemento de diseño</w:t>
+              <w:t xml:space="preserve">Elemento de diseño que responde</w:t>
             </w:r>
           </w:p>
         </w:tc>
@@ -7218,7 +7218,7 @@
       <w:tr>
         <w:tc>
           <w:tcPr>
-            <w:tcW w:type="dxa" w:w="2100"/>
+            <w:tcW w:type="dxa" w:w="1550"/>
             <w:tcMar>
               <w:top w:type="dxa" w:w="30"/>
               <w:left w:type="dxa" w:w="70"/>
@@ -7244,7 +7244,7 @@
         </w:tc>
         <w:tc>
           <w:tcPr>
-            <w:tcW w:type="dxa" w:w="2760"/>
+            <w:tcW w:type="dxa" w:w="2560"/>
             <w:tcMar>
               <w:top w:type="dxa" w:w="30"/>
               <w:left w:type="dxa" w:w="70"/>
@@ -7270,27 +7270,27 @@
         </w:tc>
         <w:tc>
           <w:tcPr>
-            <w:tcW w:type="dxa" w:w="4500"/>
-            <w:tcMar>
-              <w:top w:type="dxa" w:w="30"/>
-              <w:left w:type="dxa" w:w="70"/>
-              <w:bottom w:type="dxa" w:w="30"/>
-              <w:right w:type="dxa" w:w="70"/>
-            </w:tcMar>
-            <w:vAlign w:val="center"/>
-          </w:tcPr>
-          <w:p>
-            <w:pPr>
-              <w:spacing w:after="20" w:line="240"/>
-              <w:jc w:val="left"/>
-            </w:pPr>
-            <w:r>
-              <w:rPr>
-                <w:rFonts w:ascii="Times New Roman" w:cs="Times New Roman" w:eastAsia="Times New Roman" w:hAnsi="Times New Roman"/>
-                <w:sz w:val="19"/>
-                <w:szCs w:val="19"/>
-              </w:rPr>
-              <w:t xml:space="preserve">Diagramas de actividades (Fig. 5), secuencia (Fig. 6) y estados (Fig. 7); interfaz de incidencias (Fig. 15); componente Gestión de incidencias (Fig. 12).</w:t>
+            <w:tcW w:type="dxa" w:w="5250"/>
+            <w:tcMar>
+              <w:top w:type="dxa" w:w="30"/>
+              <w:left w:type="dxa" w:w="70"/>
+              <w:bottom w:type="dxa" w:w="30"/>
+              <w:right w:type="dxa" w:w="70"/>
+            </w:tcMar>
+            <w:vAlign w:val="center"/>
+          </w:tcPr>
+          <w:p>
+            <w:pPr>
+              <w:spacing w:after="20" w:line="240"/>
+              <w:jc w:val="left"/>
+            </w:pPr>
+            <w:r>
+              <w:rPr>
+                <w:rFonts w:ascii="Times New Roman" w:cs="Times New Roman" w:eastAsia="Times New Roman" w:hAnsi="Times New Roman"/>
+                <w:sz w:val="19"/>
+                <w:szCs w:val="19"/>
+              </w:rPr>
+              <w:t xml:space="preserve">Diagramas de actividades (Figura 5), secuencia (Figura 6) y estados (Figura 7); interfaz de incidencias (Figura 15); componente Gestión de incidencias (Figura 12).</w:t>
             </w:r>
           </w:p>
         </w:tc>
@@ -7298,7 +7298,7 @@
       <w:tr>
         <w:tc>
           <w:tcPr>
-            <w:tcW w:type="dxa" w:w="2100"/>
+            <w:tcW w:type="dxa" w:w="1550"/>
             <w:shd w:fill="F2F2F2" w:color="auto" w:val="clear"/>
             <w:tcMar>
               <w:top w:type="dxa" w:w="30"/>
@@ -7325,7 +7325,7 @@
         </w:tc>
         <w:tc>
           <w:tcPr>
-            <w:tcW w:type="dxa" w:w="2760"/>
+            <w:tcW w:type="dxa" w:w="2560"/>
             <w:shd w:fill="F2F2F2" w:color="auto" w:val="clear"/>
             <w:tcMar>
               <w:top w:type="dxa" w:w="30"/>
@@ -7352,7 +7352,7 @@
         </w:tc>
         <w:tc>
           <w:tcPr>
-            <w:tcW w:type="dxa" w:w="4500"/>
+            <w:tcW w:type="dxa" w:w="5250"/>
             <w:shd w:fill="F2F2F2" w:color="auto" w:val="clear"/>
             <w:tcMar>
               <w:top w:type="dxa" w:w="30"/>
@@ -7373,7 +7373,7 @@
                 <w:sz w:val="19"/>
                 <w:szCs w:val="19"/>
               </w:rPr>
-              <w:t xml:space="preserve">Componente Gestión de mantenimiento (Fig. 12); entidad Mantenimiento (Fig. 10).</w:t>
+              <w:t xml:space="preserve">Componente Gestión de mantenimiento (Figura 12); entidad Mantenimiento (Figura 10).</w:t>
             </w:r>
           </w:p>
         </w:tc>
@@ -7381,7 +7381,7 @@
       <w:tr>
         <w:tc>
           <w:tcPr>
-            <w:tcW w:type="dxa" w:w="2100"/>
+            <w:tcW w:type="dxa" w:w="1550"/>
             <w:tcMar>
               <w:top w:type="dxa" w:w="30"/>
               <w:left w:type="dxa" w:w="70"/>
@@ -7407,7 +7407,7 @@
         </w:tc>
         <w:tc>
           <w:tcPr>
-            <w:tcW w:type="dxa" w:w="2760"/>
+            <w:tcW w:type="dxa" w:w="2560"/>
             <w:tcMar>
               <w:top w:type="dxa" w:w="30"/>
               <w:left w:type="dxa" w:w="70"/>
@@ -7433,27 +7433,27 @@
         </w:tc>
         <w:tc>
           <w:tcPr>
-            <w:tcW w:type="dxa" w:w="4500"/>
-            <w:tcMar>
-              <w:top w:type="dxa" w:w="30"/>
-              <w:left w:type="dxa" w:w="70"/>
-              <w:bottom w:type="dxa" w:w="30"/>
-              <w:right w:type="dxa" w:w="70"/>
-            </w:tcMar>
-            <w:vAlign w:val="center"/>
-          </w:tcPr>
-          <w:p>
-            <w:pPr>
-              <w:spacing w:after="20" w:line="240"/>
-              <w:jc w:val="left"/>
-            </w:pPr>
-            <w:r>
-              <w:rPr>
-                <w:rFonts w:ascii="Times New Roman" w:cs="Times New Roman" w:eastAsia="Times New Roman" w:hAnsi="Times New Roman"/>
-                <w:sz w:val="19"/>
-                <w:szCs w:val="19"/>
-              </w:rPr>
-              <w:t xml:space="preserve">Diagramas de secuencia (Fig. 6) y de estados de riesgo (Fig. 8); interfaz de alertas (Fig. 16); componentes Análisis predictivo y Alertas (Fig. 12).</w:t>
+            <w:tcW w:type="dxa" w:w="5250"/>
+            <w:tcMar>
+              <w:top w:type="dxa" w:w="30"/>
+              <w:left w:type="dxa" w:w="70"/>
+              <w:bottom w:type="dxa" w:w="30"/>
+              <w:right w:type="dxa" w:w="70"/>
+            </w:tcMar>
+            <w:vAlign w:val="center"/>
+          </w:tcPr>
+          <w:p>
+            <w:pPr>
+              <w:spacing w:after="20" w:line="240"/>
+              <w:jc w:val="left"/>
+            </w:pPr>
+            <w:r>
+              <w:rPr>
+                <w:rFonts w:ascii="Times New Roman" w:cs="Times New Roman" w:eastAsia="Times New Roman" w:hAnsi="Times New Roman"/>
+                <w:sz w:val="19"/>
+                <w:szCs w:val="19"/>
+              </w:rPr>
+              <w:t xml:space="preserve">Diagramas de secuencia (Figura 6) y de estados de riesgo (Figura 8); interfaz de alertas (Figura 16); componentes Análisis predictivo y Alertas (Figura 12).</w:t>
             </w:r>
           </w:p>
         </w:tc>
@@ -7461,7 +7461,7 @@
       <w:tr>
         <w:tc>
           <w:tcPr>
-            <w:tcW w:type="dxa" w:w="2100"/>
+            <w:tcW w:type="dxa" w:w="1550"/>
             <w:shd w:fill="F2F2F2" w:color="auto" w:val="clear"/>
             <w:tcMar>
               <w:top w:type="dxa" w:w="30"/>
@@ -7488,7 +7488,7 @@
         </w:tc>
         <w:tc>
           <w:tcPr>
-            <w:tcW w:type="dxa" w:w="2760"/>
+            <w:tcW w:type="dxa" w:w="2560"/>
             <w:shd w:fill="F2F2F2" w:color="auto" w:val="clear"/>
             <w:tcMar>
               <w:top w:type="dxa" w:w="30"/>
@@ -7509,13 +7509,13 @@
                 <w:sz w:val="19"/>
                 <w:szCs w:val="19"/>
               </w:rPr>
-              <w:t xml:space="preserve">Visualizar tablero de control</w:t>
-            </w:r>
-          </w:p>
-        </w:tc>
-        <w:tc>
-          <w:tcPr>
-            <w:tcW w:type="dxa" w:w="4500"/>
+              <w:t xml:space="preserve">Visualizar el tablero de control</w:t>
+            </w:r>
+          </w:p>
+        </w:tc>
+        <w:tc>
+          <w:tcPr>
+            <w:tcW w:type="dxa" w:w="5250"/>
             <w:shd w:fill="F2F2F2" w:color="auto" w:val="clear"/>
             <w:tcMar>
               <w:top w:type="dxa" w:w="30"/>
@@ -7536,7 +7536,7 @@
                 <w:sz w:val="19"/>
                 <w:szCs w:val="19"/>
               </w:rPr>
-              <w:t xml:space="preserve">Interfaz del tablero (Fig. 14); componente Reportes (Fig. 12).</w:t>
+              <w:t xml:space="preserve">Interfaz del tablero (Figura 14); componente Reportes (Figura 12).</w:t>
             </w:r>
           </w:p>
         </w:tc>
@@ -7544,7 +7544,7 @@
       <w:tr>
         <w:tc>
           <w:tcPr>
-            <w:tcW w:type="dxa" w:w="2100"/>
+            <w:tcW w:type="dxa" w:w="1550"/>
             <w:tcMar>
               <w:top w:type="dxa" w:w="30"/>
               <w:left w:type="dxa" w:w="70"/>
@@ -7570,7 +7570,7 @@
         </w:tc>
         <w:tc>
           <w:tcPr>
-            <w:tcW w:type="dxa" w:w="2760"/>
+            <w:tcW w:type="dxa" w:w="2560"/>
             <w:tcMar>
               <w:top w:type="dxa" w:w="30"/>
               <w:left w:type="dxa" w:w="70"/>
@@ -7596,27 +7596,27 @@
         </w:tc>
         <w:tc>
           <w:tcPr>
-            <w:tcW w:type="dxa" w:w="4500"/>
-            <w:tcMar>
-              <w:top w:type="dxa" w:w="30"/>
-              <w:left w:type="dxa" w:w="70"/>
-              <w:bottom w:type="dxa" w:w="30"/>
-              <w:right w:type="dxa" w:w="70"/>
-            </w:tcMar>
-            <w:vAlign w:val="center"/>
-          </w:tcPr>
-          <w:p>
-            <w:pPr>
-              <w:spacing w:after="20" w:line="240"/>
-              <w:jc w:val="left"/>
-            </w:pPr>
-            <w:r>
-              <w:rPr>
-                <w:rFonts w:ascii="Times New Roman" w:cs="Times New Roman" w:eastAsia="Times New Roman" w:hAnsi="Times New Roman"/>
-                <w:sz w:val="19"/>
-                <w:szCs w:val="19"/>
-              </w:rPr>
-              <w:t xml:space="preserve">Interfaz de inicio de sesión (Fig. 13); componente Gestión de usuarios (Fig. 12); diseño de seguridad (Fig. 17).</w:t>
+            <w:tcW w:type="dxa" w:w="5250"/>
+            <w:tcMar>
+              <w:top w:type="dxa" w:w="30"/>
+              <w:left w:type="dxa" w:w="70"/>
+              <w:bottom w:type="dxa" w:w="30"/>
+              <w:right w:type="dxa" w:w="70"/>
+            </w:tcMar>
+            <w:vAlign w:val="center"/>
+          </w:tcPr>
+          <w:p>
+            <w:pPr>
+              <w:spacing w:after="20" w:line="240"/>
+              <w:jc w:val="left"/>
+            </w:pPr>
+            <w:r>
+              <w:rPr>
+                <w:rFonts w:ascii="Times New Roman" w:cs="Times New Roman" w:eastAsia="Times New Roman" w:hAnsi="Times New Roman"/>
+                <w:sz w:val="19"/>
+                <w:szCs w:val="19"/>
+              </w:rPr>
+              <w:t xml:space="preserve">Interfaz de inicio de sesión (Figura 13); componente Gestión de usuarios (Figura 12); diseño de seguridad (Figura 17).</w:t>
             </w:r>
           </w:p>
         </w:tc>
@@ -7624,7 +7624,7 @@
       <w:tr>
         <w:tc>
           <w:tcPr>
-            <w:tcW w:type="dxa" w:w="2100"/>
+            <w:tcW w:type="dxa" w:w="1550"/>
             <w:shd w:fill="F2F2F2" w:color="auto" w:val="clear"/>
             <w:tcMar>
               <w:top w:type="dxa" w:w="30"/>
@@ -7651,7 +7651,7 @@
         </w:tc>
         <w:tc>
           <w:tcPr>
-            <w:tcW w:type="dxa" w:w="2760"/>
+            <w:tcW w:type="dxa" w:w="2560"/>
             <w:shd w:fill="F2F2F2" w:color="auto" w:val="clear"/>
             <w:tcMar>
               <w:top w:type="dxa" w:w="30"/>
@@ -7672,13 +7672,13 @@
                 <w:sz w:val="19"/>
                 <w:szCs w:val="19"/>
               </w:rPr>
-              <w:t xml:space="preserve">Generar reportes</w:t>
-            </w:r>
-          </w:p>
-        </w:tc>
-        <w:tc>
-          <w:tcPr>
-            <w:tcW w:type="dxa" w:w="4500"/>
+              <w:t xml:space="preserve">Generar reportes e historial</w:t>
+            </w:r>
+          </w:p>
+        </w:tc>
+        <w:tc>
+          <w:tcPr>
+            <w:tcW w:type="dxa" w:w="5250"/>
             <w:shd w:fill="F2F2F2" w:color="auto" w:val="clear"/>
             <w:tcMar>
               <w:top w:type="dxa" w:w="30"/>
@@ -7699,7 +7699,7 @@
                 <w:sz w:val="19"/>
                 <w:szCs w:val="19"/>
               </w:rPr>
-              <w:t xml:space="preserve">Componente Reportes (Fig. 12); entidades de la base de datos (Fig. 10).</w:t>
+              <w:t xml:space="preserve">Componente Reportes (Figura 12); entidades de la base de datos (Figura 10).</w:t>
             </w:r>
           </w:p>
         </w:tc>
@@ -7707,79 +7707,79 @@
       <w:tr>
         <w:tc>
           <w:tcPr>
-            <w:tcW w:type="dxa" w:w="2100"/>
-            <w:tcMar>
-              <w:top w:type="dxa" w:w="30"/>
-              <w:left w:type="dxa" w:w="70"/>
-              <w:bottom w:type="dxa" w:w="30"/>
-              <w:right w:type="dxa" w:w="70"/>
-            </w:tcMar>
-            <w:vAlign w:val="center"/>
-          </w:tcPr>
-          <w:p>
-            <w:pPr>
-              <w:spacing w:after="20" w:line="240"/>
-              <w:jc w:val="left"/>
-            </w:pPr>
-            <w:r>
-              <w:rPr>
-                <w:rFonts w:ascii="Times New Roman" w:cs="Times New Roman" w:eastAsia="Times New Roman" w:hAnsi="Times New Roman"/>
-                <w:sz w:val="19"/>
-                <w:szCs w:val="19"/>
-              </w:rPr>
-              <w:t xml:space="preserve">RNF-01…RNF-04, RNF-14</w:t>
-            </w:r>
-          </w:p>
-        </w:tc>
-        <w:tc>
-          <w:tcPr>
-            <w:tcW w:type="dxa" w:w="2760"/>
-            <w:tcMar>
-              <w:top w:type="dxa" w:w="30"/>
-              <w:left w:type="dxa" w:w="70"/>
-              <w:bottom w:type="dxa" w:w="30"/>
-              <w:right w:type="dxa" w:w="70"/>
-            </w:tcMar>
-            <w:vAlign w:val="center"/>
-          </w:tcPr>
-          <w:p>
-            <w:pPr>
-              <w:spacing w:after="20" w:line="240"/>
-              <w:jc w:val="left"/>
-            </w:pPr>
-            <w:r>
-              <w:rPr>
-                <w:rFonts w:ascii="Times New Roman" w:cs="Times New Roman" w:eastAsia="Times New Roman" w:hAnsi="Times New Roman"/>
-                <w:sz w:val="19"/>
-                <w:szCs w:val="19"/>
-              </w:rPr>
-              <w:t xml:space="preserve">Acceso seguro y trazabilidad</w:t>
-            </w:r>
-          </w:p>
-        </w:tc>
-        <w:tc>
-          <w:tcPr>
-            <w:tcW w:type="dxa" w:w="4500"/>
-            <w:tcMar>
-              <w:top w:type="dxa" w:w="30"/>
-              <w:left w:type="dxa" w:w="70"/>
-              <w:bottom w:type="dxa" w:w="30"/>
-              <w:right w:type="dxa" w:w="70"/>
-            </w:tcMar>
-            <w:vAlign w:val="center"/>
-          </w:tcPr>
-          <w:p>
-            <w:pPr>
-              <w:spacing w:after="20" w:line="240"/>
-              <w:jc w:val="left"/>
-            </w:pPr>
-            <w:r>
-              <w:rPr>
-                <w:rFonts w:ascii="Times New Roman" w:cs="Times New Roman" w:eastAsia="Times New Roman" w:hAnsi="Times New Roman"/>
-                <w:sz w:val="19"/>
-                <w:szCs w:val="19"/>
-              </w:rPr>
-              <w:t xml:space="preserve">Diseño de seguridad (Fig. 17); mecanismos de seguridad (Tabla 31); matriz de acceso por rol (Tabla 32).</w:t>
+            <w:tcW w:type="dxa" w:w="1550"/>
+            <w:tcMar>
+              <w:top w:type="dxa" w:w="30"/>
+              <w:left w:type="dxa" w:w="70"/>
+              <w:bottom w:type="dxa" w:w="30"/>
+              <w:right w:type="dxa" w:w="70"/>
+            </w:tcMar>
+            <w:vAlign w:val="center"/>
+          </w:tcPr>
+          <w:p>
+            <w:pPr>
+              <w:spacing w:after="20" w:line="240"/>
+              <w:jc w:val="left"/>
+            </w:pPr>
+            <w:r>
+              <w:rPr>
+                <w:rFonts w:ascii="Times New Roman" w:cs="Times New Roman" w:eastAsia="Times New Roman" w:hAnsi="Times New Roman"/>
+                <w:sz w:val="19"/>
+                <w:szCs w:val="19"/>
+              </w:rPr>
+              <w:t xml:space="preserve">RNF-01</w:t>
+            </w:r>
+          </w:p>
+        </w:tc>
+        <w:tc>
+          <w:tcPr>
+            <w:tcW w:type="dxa" w:w="2560"/>
+            <w:tcMar>
+              <w:top w:type="dxa" w:w="30"/>
+              <w:left w:type="dxa" w:w="70"/>
+              <w:bottom w:type="dxa" w:w="30"/>
+              <w:right w:type="dxa" w:w="70"/>
+            </w:tcMar>
+            <w:vAlign w:val="center"/>
+          </w:tcPr>
+          <w:p>
+            <w:pPr>
+              <w:spacing w:after="20" w:line="240"/>
+              <w:jc w:val="left"/>
+            </w:pPr>
+            <w:r>
+              <w:rPr>
+                <w:rFonts w:ascii="Times New Roman" w:cs="Times New Roman" w:eastAsia="Times New Roman" w:hAnsi="Times New Roman"/>
+                <w:sz w:val="19"/>
+                <w:szCs w:val="19"/>
+              </w:rPr>
+              <w:t xml:space="preserve">Seguridad — hashing de contraseñas</w:t>
+            </w:r>
+          </w:p>
+        </w:tc>
+        <w:tc>
+          <w:tcPr>
+            <w:tcW w:type="dxa" w:w="5250"/>
+            <w:tcMar>
+              <w:top w:type="dxa" w:w="30"/>
+              <w:left w:type="dxa" w:w="70"/>
+              <w:bottom w:type="dxa" w:w="30"/>
+              <w:right w:type="dxa" w:w="70"/>
+            </w:tcMar>
+            <w:vAlign w:val="center"/>
+          </w:tcPr>
+          <w:p>
+            <w:pPr>
+              <w:spacing w:after="20" w:line="240"/>
+              <w:jc w:val="left"/>
+            </w:pPr>
+            <w:r>
+              <w:rPr>
+                <w:rFonts w:ascii="Times New Roman" w:cs="Times New Roman" w:eastAsia="Times New Roman" w:hAnsi="Times New Roman"/>
+                <w:sz w:val="19"/>
+                <w:szCs w:val="19"/>
+              </w:rPr>
+              <w:t xml:space="preserve">Diseño de seguridad (Figura 17); mecanismos de seguridad (Tabla 31).</w:t>
             </w:r>
           </w:p>
         </w:tc>
@@ -7787,7 +7787,7 @@
       <w:tr>
         <w:tc>
           <w:tcPr>
-            <w:tcW w:type="dxa" w:w="2100"/>
+            <w:tcW w:type="dxa" w:w="1550"/>
             <w:shd w:fill="F2F2F2" w:color="auto" w:val="clear"/>
             <w:tcMar>
               <w:top w:type="dxa" w:w="30"/>
@@ -7808,13 +7808,13 @@
                 <w:sz w:val="19"/>
                 <w:szCs w:val="19"/>
               </w:rPr>
-              <w:t xml:space="preserve">RNF-09</w:t>
-            </w:r>
-          </w:p>
-        </w:tc>
-        <w:tc>
-          <w:tcPr>
-            <w:tcW w:type="dxa" w:w="2760"/>
+              <w:t xml:space="preserve">RNF-02</w:t>
+            </w:r>
+          </w:p>
+        </w:tc>
+        <w:tc>
+          <w:tcPr>
+            <w:tcW w:type="dxa" w:w="2560"/>
             <w:shd w:fill="F2F2F2" w:color="auto" w:val="clear"/>
             <w:tcMar>
               <w:top w:type="dxa" w:w="30"/>
@@ -7835,13 +7835,13 @@
                 <w:sz w:val="19"/>
                 <w:szCs w:val="19"/>
               </w:rPr>
-              <w:t xml:space="preserve">Usabilidad de la interfaz</w:t>
-            </w:r>
-          </w:p>
-        </w:tc>
-        <w:tc>
-          <w:tcPr>
-            <w:tcW w:type="dxa" w:w="4500"/>
+              <w:t xml:space="preserve">Seguridad — control de acceso por rol</w:t>
+            </w:r>
+          </w:p>
+        </w:tc>
+        <w:tc>
+          <w:tcPr>
+            <w:tcW w:type="dxa" w:w="5250"/>
             <w:shd w:fill="F2F2F2" w:color="auto" w:val="clear"/>
             <w:tcMar>
               <w:top w:type="dxa" w:w="30"/>
@@ -7862,7 +7862,7 @@
                 <w:sz w:val="19"/>
                 <w:szCs w:val="19"/>
               </w:rPr>
-              <w:t xml:space="preserve">Diseño de interfaces (Fig. 13 a 16).</w:t>
+              <w:t xml:space="preserve">Diseño de seguridad (Figura 17); matriz de control de acceso por rol (Tabla 32).</w:t>
             </w:r>
           </w:p>
         </w:tc>
@@ -7870,79 +7870,79 @@
       <w:tr>
         <w:tc>
           <w:tcPr>
-            <w:tcW w:type="dxa" w:w="2100"/>
-            <w:tcMar>
-              <w:top w:type="dxa" w:w="30"/>
-              <w:left w:type="dxa" w:w="70"/>
-              <w:bottom w:type="dxa" w:w="30"/>
-              <w:right w:type="dxa" w:w="70"/>
-            </w:tcMar>
-            <w:vAlign w:val="center"/>
-          </w:tcPr>
-          <w:p>
-            <w:pPr>
-              <w:spacing w:after="20" w:line="240"/>
-              <w:jc w:val="left"/>
-            </w:pPr>
-            <w:r>
-              <w:rPr>
-                <w:rFonts w:ascii="Times New Roman" w:cs="Times New Roman" w:eastAsia="Times New Roman" w:hAnsi="Times New Roman"/>
-                <w:sz w:val="19"/>
-                <w:szCs w:val="19"/>
-              </w:rPr>
-              <w:t xml:space="preserve">RNF-12</w:t>
-            </w:r>
-          </w:p>
-        </w:tc>
-        <w:tc>
-          <w:tcPr>
-            <w:tcW w:type="dxa" w:w="2760"/>
-            <w:tcMar>
-              <w:top w:type="dxa" w:w="30"/>
-              <w:left w:type="dxa" w:w="70"/>
-              <w:bottom w:type="dxa" w:w="30"/>
-              <w:right w:type="dxa" w:w="70"/>
-            </w:tcMar>
-            <w:vAlign w:val="center"/>
-          </w:tcPr>
-          <w:p>
-            <w:pPr>
-              <w:spacing w:after="20" w:line="240"/>
-              <w:jc w:val="left"/>
-            </w:pPr>
-            <w:r>
-              <w:rPr>
-                <w:rFonts w:ascii="Times New Roman" w:cs="Times New Roman" w:eastAsia="Times New Roman" w:hAnsi="Times New Roman"/>
-                <w:sz w:val="19"/>
-                <w:szCs w:val="19"/>
-              </w:rPr>
-              <w:t xml:space="preserve">Desempeño del modelo predictivo</w:t>
-            </w:r>
-          </w:p>
-        </w:tc>
-        <w:tc>
-          <w:tcPr>
-            <w:tcW w:type="dxa" w:w="4500"/>
-            <w:tcMar>
-              <w:top w:type="dxa" w:w="30"/>
-              <w:left w:type="dxa" w:w="70"/>
-              <w:bottom w:type="dxa" w:w="30"/>
-              <w:right w:type="dxa" w:w="70"/>
-            </w:tcMar>
-            <w:vAlign w:val="center"/>
-          </w:tcPr>
-          <w:p>
-            <w:pPr>
-              <w:spacing w:after="20" w:line="240"/>
-              <w:jc w:val="left"/>
-            </w:pPr>
-            <w:r>
-              <w:rPr>
-                <w:rFonts w:ascii="Times New Roman" w:cs="Times New Roman" w:eastAsia="Times New Roman" w:hAnsi="Times New Roman"/>
-                <w:sz w:val="19"/>
-                <w:szCs w:val="19"/>
-              </w:rPr>
-              <w:t xml:space="preserve">Componente Servicio predictivo (Fig. 12); diagrama de estados de riesgo (Fig. 8).</w:t>
+            <w:tcW w:type="dxa" w:w="1550"/>
+            <w:tcMar>
+              <w:top w:type="dxa" w:w="30"/>
+              <w:left w:type="dxa" w:w="70"/>
+              <w:bottom w:type="dxa" w:w="30"/>
+              <w:right w:type="dxa" w:w="70"/>
+            </w:tcMar>
+            <w:vAlign w:val="center"/>
+          </w:tcPr>
+          <w:p>
+            <w:pPr>
+              <w:spacing w:after="20" w:line="240"/>
+              <w:jc w:val="left"/>
+            </w:pPr>
+            <w:r>
+              <w:rPr>
+                <w:rFonts w:ascii="Times New Roman" w:cs="Times New Roman" w:eastAsia="Times New Roman" w:hAnsi="Times New Roman"/>
+                <w:sz w:val="19"/>
+                <w:szCs w:val="19"/>
+              </w:rPr>
+              <w:t xml:space="preserve">RNF-03</w:t>
+            </w:r>
+          </w:p>
+        </w:tc>
+        <w:tc>
+          <w:tcPr>
+            <w:tcW w:type="dxa" w:w="2560"/>
+            <w:tcMar>
+              <w:top w:type="dxa" w:w="30"/>
+              <w:left w:type="dxa" w:w="70"/>
+              <w:bottom w:type="dxa" w:w="30"/>
+              <w:right w:type="dxa" w:w="70"/>
+            </w:tcMar>
+            <w:vAlign w:val="center"/>
+          </w:tcPr>
+          <w:p>
+            <w:pPr>
+              <w:spacing w:after="20" w:line="240"/>
+              <w:jc w:val="left"/>
+            </w:pPr>
+            <w:r>
+              <w:rPr>
+                <w:rFonts w:ascii="Times New Roman" w:cs="Times New Roman" w:eastAsia="Times New Roman" w:hAnsi="Times New Roman"/>
+                <w:sz w:val="19"/>
+                <w:szCs w:val="19"/>
+              </w:rPr>
+              <w:t xml:space="preserve">Seguridad — comunicación cifrada</w:t>
+            </w:r>
+          </w:p>
+        </w:tc>
+        <w:tc>
+          <w:tcPr>
+            <w:tcW w:type="dxa" w:w="5250"/>
+            <w:tcMar>
+              <w:top w:type="dxa" w:w="30"/>
+              <w:left w:type="dxa" w:w="70"/>
+              <w:bottom w:type="dxa" w:w="30"/>
+              <w:right w:type="dxa" w:w="70"/>
+            </w:tcMar>
+            <w:vAlign w:val="center"/>
+          </w:tcPr>
+          <w:p>
+            <w:pPr>
+              <w:spacing w:after="20" w:line="240"/>
+              <w:jc w:val="left"/>
+            </w:pPr>
+            <w:r>
+              <w:rPr>
+                <w:rFonts w:ascii="Times New Roman" w:cs="Times New Roman" w:eastAsia="Times New Roman" w:hAnsi="Times New Roman"/>
+                <w:sz w:val="19"/>
+                <w:szCs w:val="19"/>
+              </w:rPr>
+              <w:t xml:space="preserve">Diseño de seguridad (Figura 17); diagrama de infraestructura (Figura 11).</w:t>
             </w:r>
           </w:p>
         </w:tc>
@@ -7950,7 +7950,7 @@
       <w:tr>
         <w:tc>
           <w:tcPr>
-            <w:tcW w:type="dxa" w:w="2100"/>
+            <w:tcW w:type="dxa" w:w="1550"/>
             <w:shd w:fill="F2F2F2" w:color="auto" w:val="clear"/>
             <w:tcMar>
               <w:top w:type="dxa" w:w="30"/>
@@ -7971,13 +7971,801 @@
                 <w:sz w:val="19"/>
                 <w:szCs w:val="19"/>
               </w:rPr>
+              <w:t xml:space="preserve">RNF-04</w:t>
+            </w:r>
+          </w:p>
+        </w:tc>
+        <w:tc>
+          <w:tcPr>
+            <w:tcW w:type="dxa" w:w="2560"/>
+            <w:shd w:fill="F2F2F2" w:color="auto" w:val="clear"/>
+            <w:tcMar>
+              <w:top w:type="dxa" w:w="30"/>
+              <w:left w:type="dxa" w:w="70"/>
+              <w:bottom w:type="dxa" w:w="30"/>
+              <w:right w:type="dxa" w:w="70"/>
+            </w:tcMar>
+            <w:vAlign w:val="center"/>
+          </w:tcPr>
+          <w:p>
+            <w:pPr>
+              <w:spacing w:after="20" w:line="240"/>
+              <w:jc w:val="left"/>
+            </w:pPr>
+            <w:r>
+              <w:rPr>
+                <w:rFonts w:ascii="Times New Roman" w:cs="Times New Roman" w:eastAsia="Times New Roman" w:hAnsi="Times New Roman"/>
+                <w:sz w:val="19"/>
+                <w:szCs w:val="19"/>
+              </w:rPr>
+              <w:t xml:space="preserve">Seguridad — bloqueo por intentos</w:t>
+            </w:r>
+          </w:p>
+        </w:tc>
+        <w:tc>
+          <w:tcPr>
+            <w:tcW w:type="dxa" w:w="5250"/>
+            <w:shd w:fill="F2F2F2" w:color="auto" w:val="clear"/>
+            <w:tcMar>
+              <w:top w:type="dxa" w:w="30"/>
+              <w:left w:type="dxa" w:w="70"/>
+              <w:bottom w:type="dxa" w:w="30"/>
+              <w:right w:type="dxa" w:w="70"/>
+            </w:tcMar>
+            <w:vAlign w:val="center"/>
+          </w:tcPr>
+          <w:p>
+            <w:pPr>
+              <w:spacing w:after="20" w:line="240"/>
+              <w:jc w:val="left"/>
+            </w:pPr>
+            <w:r>
+              <w:rPr>
+                <w:rFonts w:ascii="Times New Roman" w:cs="Times New Roman" w:eastAsia="Times New Roman" w:hAnsi="Times New Roman"/>
+                <w:sz w:val="19"/>
+                <w:szCs w:val="19"/>
+              </w:rPr>
+              <w:t xml:space="preserve">Diseño de seguridad (Figura 17); mecanismos de seguridad (Tabla 31).</w:t>
+            </w:r>
+          </w:p>
+        </w:tc>
+      </w:tr>
+      <w:tr>
+        <w:tc>
+          <w:tcPr>
+            <w:tcW w:type="dxa" w:w="1550"/>
+            <w:tcMar>
+              <w:top w:type="dxa" w:w="30"/>
+              <w:left w:type="dxa" w:w="70"/>
+              <w:bottom w:type="dxa" w:w="30"/>
+              <w:right w:type="dxa" w:w="70"/>
+            </w:tcMar>
+            <w:vAlign w:val="center"/>
+          </w:tcPr>
+          <w:p>
+            <w:pPr>
+              <w:spacing w:after="20" w:line="240"/>
+              <w:jc w:val="left"/>
+            </w:pPr>
+            <w:r>
+              <w:rPr>
+                <w:rFonts w:ascii="Times New Roman" w:cs="Times New Roman" w:eastAsia="Times New Roman" w:hAnsi="Times New Roman"/>
+                <w:sz w:val="19"/>
+                <w:szCs w:val="19"/>
+              </w:rPr>
+              <w:t xml:space="preserve">RNF-05</w:t>
+            </w:r>
+          </w:p>
+        </w:tc>
+        <w:tc>
+          <w:tcPr>
+            <w:tcW w:type="dxa" w:w="2560"/>
+            <w:tcMar>
+              <w:top w:type="dxa" w:w="30"/>
+              <w:left w:type="dxa" w:w="70"/>
+              <w:bottom w:type="dxa" w:w="30"/>
+              <w:right w:type="dxa" w:w="70"/>
+            </w:tcMar>
+            <w:vAlign w:val="center"/>
+          </w:tcPr>
+          <w:p>
+            <w:pPr>
+              <w:spacing w:after="20" w:line="240"/>
+              <w:jc w:val="left"/>
+            </w:pPr>
+            <w:r>
+              <w:rPr>
+                <w:rFonts w:ascii="Times New Roman" w:cs="Times New Roman" w:eastAsia="Times New Roman" w:hAnsi="Times New Roman"/>
+                <w:sz w:val="19"/>
+                <w:szCs w:val="19"/>
+              </w:rPr>
+              <w:t xml:space="preserve">Rendimiento — tiempo de respuesta</w:t>
+            </w:r>
+          </w:p>
+        </w:tc>
+        <w:tc>
+          <w:tcPr>
+            <w:tcW w:type="dxa" w:w="5250"/>
+            <w:tcMar>
+              <w:top w:type="dxa" w:w="30"/>
+              <w:left w:type="dxa" w:w="70"/>
+              <w:bottom w:type="dxa" w:w="30"/>
+              <w:right w:type="dxa" w:w="70"/>
+            </w:tcMar>
+            <w:vAlign w:val="center"/>
+          </w:tcPr>
+          <w:p>
+            <w:pPr>
+              <w:spacing w:after="20" w:line="240"/>
+              <w:jc w:val="left"/>
+            </w:pPr>
+            <w:r>
+              <w:rPr>
+                <w:rFonts w:ascii="Times New Roman" w:cs="Times New Roman" w:eastAsia="Times New Roman" w:hAnsi="Times New Roman"/>
+                <w:sz w:val="19"/>
+                <w:szCs w:val="19"/>
+              </w:rPr>
+              <w:t xml:space="preserve">Arquitectura en capas (sección 5.2); diagrama de componentes (Figura 12).</w:t>
+            </w:r>
+          </w:p>
+        </w:tc>
+      </w:tr>
+      <w:tr>
+        <w:tc>
+          <w:tcPr>
+            <w:tcW w:type="dxa" w:w="1550"/>
+            <w:shd w:fill="F2F2F2" w:color="auto" w:val="clear"/>
+            <w:tcMar>
+              <w:top w:type="dxa" w:w="30"/>
+              <w:left w:type="dxa" w:w="70"/>
+              <w:bottom w:type="dxa" w:w="30"/>
+              <w:right w:type="dxa" w:w="70"/>
+            </w:tcMar>
+            <w:vAlign w:val="center"/>
+          </w:tcPr>
+          <w:p>
+            <w:pPr>
+              <w:spacing w:after="20" w:line="240"/>
+              <w:jc w:val="left"/>
+            </w:pPr>
+            <w:r>
+              <w:rPr>
+                <w:rFonts w:ascii="Times New Roman" w:cs="Times New Roman" w:eastAsia="Times New Roman" w:hAnsi="Times New Roman"/>
+                <w:sz w:val="19"/>
+                <w:szCs w:val="19"/>
+              </w:rPr>
+              <w:t xml:space="preserve">RNF-06</w:t>
+            </w:r>
+          </w:p>
+        </w:tc>
+        <w:tc>
+          <w:tcPr>
+            <w:tcW w:type="dxa" w:w="2560"/>
+            <w:shd w:fill="F2F2F2" w:color="auto" w:val="clear"/>
+            <w:tcMar>
+              <w:top w:type="dxa" w:w="30"/>
+              <w:left w:type="dxa" w:w="70"/>
+              <w:bottom w:type="dxa" w:w="30"/>
+              <w:right w:type="dxa" w:w="70"/>
+            </w:tcMar>
+            <w:vAlign w:val="center"/>
+          </w:tcPr>
+          <w:p>
+            <w:pPr>
+              <w:spacing w:after="20" w:line="240"/>
+              <w:jc w:val="left"/>
+            </w:pPr>
+            <w:r>
+              <w:rPr>
+                <w:rFonts w:ascii="Times New Roman" w:cs="Times New Roman" w:eastAsia="Times New Roman" w:hAnsi="Times New Roman"/>
+                <w:sz w:val="19"/>
+                <w:szCs w:val="19"/>
+              </w:rPr>
+              <w:t xml:space="preserve">Rendimiento — paginación</w:t>
+            </w:r>
+          </w:p>
+        </w:tc>
+        <w:tc>
+          <w:tcPr>
+            <w:tcW w:type="dxa" w:w="5250"/>
+            <w:shd w:fill="F2F2F2" w:color="auto" w:val="clear"/>
+            <w:tcMar>
+              <w:top w:type="dxa" w:w="30"/>
+              <w:left w:type="dxa" w:w="70"/>
+              <w:bottom w:type="dxa" w:w="30"/>
+              <w:right w:type="dxa" w:w="70"/>
+            </w:tcMar>
+            <w:vAlign w:val="center"/>
+          </w:tcPr>
+          <w:p>
+            <w:pPr>
+              <w:spacing w:after="20" w:line="240"/>
+              <w:jc w:val="left"/>
+            </w:pPr>
+            <w:r>
+              <w:rPr>
+                <w:rFonts w:ascii="Times New Roman" w:cs="Times New Roman" w:eastAsia="Times New Roman" w:hAnsi="Times New Roman"/>
+                <w:sz w:val="19"/>
+                <w:szCs w:val="19"/>
+              </w:rPr>
+              <w:t xml:space="preserve">Interfaz de gestión de incidencias (Figura 15).</w:t>
+            </w:r>
+          </w:p>
+        </w:tc>
+      </w:tr>
+      <w:tr>
+        <w:tc>
+          <w:tcPr>
+            <w:tcW w:type="dxa" w:w="1550"/>
+            <w:tcMar>
+              <w:top w:type="dxa" w:w="30"/>
+              <w:left w:type="dxa" w:w="70"/>
+              <w:bottom w:type="dxa" w:w="30"/>
+              <w:right w:type="dxa" w:w="70"/>
+            </w:tcMar>
+            <w:vAlign w:val="center"/>
+          </w:tcPr>
+          <w:p>
+            <w:pPr>
+              <w:spacing w:after="20" w:line="240"/>
+              <w:jc w:val="left"/>
+            </w:pPr>
+            <w:r>
+              <w:rPr>
+                <w:rFonts w:ascii="Times New Roman" w:cs="Times New Roman" w:eastAsia="Times New Roman" w:hAnsi="Times New Roman"/>
+                <w:sz w:val="19"/>
+                <w:szCs w:val="19"/>
+              </w:rPr>
+              <w:t xml:space="preserve">RNF-07</w:t>
+            </w:r>
+          </w:p>
+        </w:tc>
+        <w:tc>
+          <w:tcPr>
+            <w:tcW w:type="dxa" w:w="2560"/>
+            <w:tcMar>
+              <w:top w:type="dxa" w:w="30"/>
+              <w:left w:type="dxa" w:w="70"/>
+              <w:bottom w:type="dxa" w:w="30"/>
+              <w:right w:type="dxa" w:w="70"/>
+            </w:tcMar>
+            <w:vAlign w:val="center"/>
+          </w:tcPr>
+          <w:p>
+            <w:pPr>
+              <w:spacing w:after="20" w:line="240"/>
+              <w:jc w:val="left"/>
+            </w:pPr>
+            <w:r>
+              <w:rPr>
+                <w:rFonts w:ascii="Times New Roman" w:cs="Times New Roman" w:eastAsia="Times New Roman" w:hAnsi="Times New Roman"/>
+                <w:sz w:val="19"/>
+                <w:szCs w:val="19"/>
+              </w:rPr>
+              <w:t xml:space="preserve">Disponibilidad del sistema</w:t>
+            </w:r>
+          </w:p>
+        </w:tc>
+        <w:tc>
+          <w:tcPr>
+            <w:tcW w:type="dxa" w:w="5250"/>
+            <w:tcMar>
+              <w:top w:type="dxa" w:w="30"/>
+              <w:left w:type="dxa" w:w="70"/>
+              <w:bottom w:type="dxa" w:w="30"/>
+              <w:right w:type="dxa" w:w="70"/>
+            </w:tcMar>
+            <w:vAlign w:val="center"/>
+          </w:tcPr>
+          <w:p>
+            <w:pPr>
+              <w:spacing w:after="20" w:line="240"/>
+              <w:jc w:val="left"/>
+            </w:pPr>
+            <w:r>
+              <w:rPr>
+                <w:rFonts w:ascii="Times New Roman" w:cs="Times New Roman" w:eastAsia="Times New Roman" w:hAnsi="Times New Roman"/>
+                <w:sz w:val="19"/>
+                <w:szCs w:val="19"/>
+              </w:rPr>
+              <w:t xml:space="preserve">Diagrama de infraestructura (Figura 11); servicio de respaldos y verificación de estado.</w:t>
+            </w:r>
+          </w:p>
+        </w:tc>
+      </w:tr>
+      <w:tr>
+        <w:tc>
+          <w:tcPr>
+            <w:tcW w:type="dxa" w:w="1550"/>
+            <w:shd w:fill="F2F2F2" w:color="auto" w:val="clear"/>
+            <w:tcMar>
+              <w:top w:type="dxa" w:w="30"/>
+              <w:left w:type="dxa" w:w="70"/>
+              <w:bottom w:type="dxa" w:w="30"/>
+              <w:right w:type="dxa" w:w="70"/>
+            </w:tcMar>
+            <w:vAlign w:val="center"/>
+          </w:tcPr>
+          <w:p>
+            <w:pPr>
+              <w:spacing w:after="20" w:line="240"/>
+              <w:jc w:val="left"/>
+            </w:pPr>
+            <w:r>
+              <w:rPr>
+                <w:rFonts w:ascii="Times New Roman" w:cs="Times New Roman" w:eastAsia="Times New Roman" w:hAnsi="Times New Roman"/>
+                <w:sz w:val="19"/>
+                <w:szCs w:val="19"/>
+              </w:rPr>
+              <w:t xml:space="preserve">RNF-08</w:t>
+            </w:r>
+          </w:p>
+        </w:tc>
+        <w:tc>
+          <w:tcPr>
+            <w:tcW w:type="dxa" w:w="2560"/>
+            <w:shd w:fill="F2F2F2" w:color="auto" w:val="clear"/>
+            <w:tcMar>
+              <w:top w:type="dxa" w:w="30"/>
+              <w:left w:type="dxa" w:w="70"/>
+              <w:bottom w:type="dxa" w:w="30"/>
+              <w:right w:type="dxa" w:w="70"/>
+            </w:tcMar>
+            <w:vAlign w:val="center"/>
+          </w:tcPr>
+          <w:p>
+            <w:pPr>
+              <w:spacing w:after="20" w:line="240"/>
+              <w:jc w:val="left"/>
+            </w:pPr>
+            <w:r>
+              <w:rPr>
+                <w:rFonts w:ascii="Times New Roman" w:cs="Times New Roman" w:eastAsia="Times New Roman" w:hAnsi="Times New Roman"/>
+                <w:sz w:val="19"/>
+                <w:szCs w:val="19"/>
+              </w:rPr>
+              <w:t xml:space="preserve">Disponibilidad — reinicio y health check</w:t>
+            </w:r>
+          </w:p>
+        </w:tc>
+        <w:tc>
+          <w:tcPr>
+            <w:tcW w:type="dxa" w:w="5250"/>
+            <w:shd w:fill="F2F2F2" w:color="auto" w:val="clear"/>
+            <w:tcMar>
+              <w:top w:type="dxa" w:w="30"/>
+              <w:left w:type="dxa" w:w="70"/>
+              <w:bottom w:type="dxa" w:w="30"/>
+              <w:right w:type="dxa" w:w="70"/>
+            </w:tcMar>
+            <w:vAlign w:val="center"/>
+          </w:tcPr>
+          <w:p>
+            <w:pPr>
+              <w:spacing w:after="20" w:line="240"/>
+              <w:jc w:val="left"/>
+            </w:pPr>
+            <w:r>
+              <w:rPr>
+                <w:rFonts w:ascii="Times New Roman" w:cs="Times New Roman" w:eastAsia="Times New Roman" w:hAnsi="Times New Roman"/>
+                <w:sz w:val="19"/>
+                <w:szCs w:val="19"/>
+              </w:rPr>
+              <w:t xml:space="preserve">Diagrama de infraestructura (Figura 11); diseño de seguridad (Figura 17).</w:t>
+            </w:r>
+          </w:p>
+        </w:tc>
+      </w:tr>
+      <w:tr>
+        <w:tc>
+          <w:tcPr>
+            <w:tcW w:type="dxa" w:w="1550"/>
+            <w:tcMar>
+              <w:top w:type="dxa" w:w="30"/>
+              <w:left w:type="dxa" w:w="70"/>
+              <w:bottom w:type="dxa" w:w="30"/>
+              <w:right w:type="dxa" w:w="70"/>
+            </w:tcMar>
+            <w:vAlign w:val="center"/>
+          </w:tcPr>
+          <w:p>
+            <w:pPr>
+              <w:spacing w:after="20" w:line="240"/>
+              <w:jc w:val="left"/>
+            </w:pPr>
+            <w:r>
+              <w:rPr>
+                <w:rFonts w:ascii="Times New Roman" w:cs="Times New Roman" w:eastAsia="Times New Roman" w:hAnsi="Times New Roman"/>
+                <w:sz w:val="19"/>
+                <w:szCs w:val="19"/>
+              </w:rPr>
+              <w:t xml:space="preserve">RNF-09</w:t>
+            </w:r>
+          </w:p>
+        </w:tc>
+        <w:tc>
+          <w:tcPr>
+            <w:tcW w:type="dxa" w:w="2560"/>
+            <w:tcMar>
+              <w:top w:type="dxa" w:w="30"/>
+              <w:left w:type="dxa" w:w="70"/>
+              <w:bottom w:type="dxa" w:w="30"/>
+              <w:right w:type="dxa" w:w="70"/>
+            </w:tcMar>
+            <w:vAlign w:val="center"/>
+          </w:tcPr>
+          <w:p>
+            <w:pPr>
+              <w:spacing w:after="20" w:line="240"/>
+              <w:jc w:val="left"/>
+            </w:pPr>
+            <w:r>
+              <w:rPr>
+                <w:rFonts w:ascii="Times New Roman" w:cs="Times New Roman" w:eastAsia="Times New Roman" w:hAnsi="Times New Roman"/>
+                <w:sz w:val="19"/>
+                <w:szCs w:val="19"/>
+              </w:rPr>
+              <w:t xml:space="preserve">Usabilidad — interfaz responsiva</w:t>
+            </w:r>
+          </w:p>
+        </w:tc>
+        <w:tc>
+          <w:tcPr>
+            <w:tcW w:type="dxa" w:w="5250"/>
+            <w:tcMar>
+              <w:top w:type="dxa" w:w="30"/>
+              <w:left w:type="dxa" w:w="70"/>
+              <w:bottom w:type="dxa" w:w="30"/>
+              <w:right w:type="dxa" w:w="70"/>
+            </w:tcMar>
+            <w:vAlign w:val="center"/>
+          </w:tcPr>
+          <w:p>
+            <w:pPr>
+              <w:spacing w:after="20" w:line="240"/>
+              <w:jc w:val="left"/>
+            </w:pPr>
+            <w:r>
+              <w:rPr>
+                <w:rFonts w:ascii="Times New Roman" w:cs="Times New Roman" w:eastAsia="Times New Roman" w:hAnsi="Times New Roman"/>
+                <w:sz w:val="19"/>
+                <w:szCs w:val="19"/>
+              </w:rPr>
+              <w:t xml:space="preserve">Diseño de interfaces (Figuras 13 a 16).</w:t>
+            </w:r>
+          </w:p>
+        </w:tc>
+      </w:tr>
+      <w:tr>
+        <w:tc>
+          <w:tcPr>
+            <w:tcW w:type="dxa" w:w="1550"/>
+            <w:shd w:fill="F2F2F2" w:color="auto" w:val="clear"/>
+            <w:tcMar>
+              <w:top w:type="dxa" w:w="30"/>
+              <w:left w:type="dxa" w:w="70"/>
+              <w:bottom w:type="dxa" w:w="30"/>
+              <w:right w:type="dxa" w:w="70"/>
+            </w:tcMar>
+            <w:vAlign w:val="center"/>
+          </w:tcPr>
+          <w:p>
+            <w:pPr>
+              <w:spacing w:after="20" w:line="240"/>
+              <w:jc w:val="left"/>
+            </w:pPr>
+            <w:r>
+              <w:rPr>
+                <w:rFonts w:ascii="Times New Roman" w:cs="Times New Roman" w:eastAsia="Times New Roman" w:hAnsi="Times New Roman"/>
+                <w:sz w:val="19"/>
+                <w:szCs w:val="19"/>
+              </w:rPr>
+              <w:t xml:space="preserve">RNF-10</w:t>
+            </w:r>
+          </w:p>
+        </w:tc>
+        <w:tc>
+          <w:tcPr>
+            <w:tcW w:type="dxa" w:w="2560"/>
+            <w:shd w:fill="F2F2F2" w:color="auto" w:val="clear"/>
+            <w:tcMar>
+              <w:top w:type="dxa" w:w="30"/>
+              <w:left w:type="dxa" w:w="70"/>
+              <w:bottom w:type="dxa" w:w="30"/>
+              <w:right w:type="dxa" w:w="70"/>
+            </w:tcMar>
+            <w:vAlign w:val="center"/>
+          </w:tcPr>
+          <w:p>
+            <w:pPr>
+              <w:spacing w:after="20" w:line="240"/>
+              <w:jc w:val="left"/>
+            </w:pPr>
+            <w:r>
+              <w:rPr>
+                <w:rFonts w:ascii="Times New Roman" w:cs="Times New Roman" w:eastAsia="Times New Roman" w:hAnsi="Times New Roman"/>
+                <w:sz w:val="19"/>
+                <w:szCs w:val="19"/>
+              </w:rPr>
+              <w:t xml:space="preserve">Usabilidad — mensajes de error claros</w:t>
+            </w:r>
+          </w:p>
+        </w:tc>
+        <w:tc>
+          <w:tcPr>
+            <w:tcW w:type="dxa" w:w="5250"/>
+            <w:shd w:fill="F2F2F2" w:color="auto" w:val="clear"/>
+            <w:tcMar>
+              <w:top w:type="dxa" w:w="30"/>
+              <w:left w:type="dxa" w:w="70"/>
+              <w:bottom w:type="dxa" w:w="30"/>
+              <w:right w:type="dxa" w:w="70"/>
+            </w:tcMar>
+            <w:vAlign w:val="center"/>
+          </w:tcPr>
+          <w:p>
+            <w:pPr>
+              <w:spacing w:after="20" w:line="240"/>
+              <w:jc w:val="left"/>
+            </w:pPr>
+            <w:r>
+              <w:rPr>
+                <w:rFonts w:ascii="Times New Roman" w:cs="Times New Roman" w:eastAsia="Times New Roman" w:hAnsi="Times New Roman"/>
+                <w:sz w:val="19"/>
+                <w:szCs w:val="19"/>
+              </w:rPr>
+              <w:t xml:space="preserve">Interfaz de inicio de sesión (Figura 13) y demás interfaces (Figuras 14 a 16).</w:t>
+            </w:r>
+          </w:p>
+        </w:tc>
+      </w:tr>
+      <w:tr>
+        <w:tc>
+          <w:tcPr>
+            <w:tcW w:type="dxa" w:w="1550"/>
+            <w:tcMar>
+              <w:top w:type="dxa" w:w="30"/>
+              <w:left w:type="dxa" w:w="70"/>
+              <w:bottom w:type="dxa" w:w="30"/>
+              <w:right w:type="dxa" w:w="70"/>
+            </w:tcMar>
+            <w:vAlign w:val="center"/>
+          </w:tcPr>
+          <w:p>
+            <w:pPr>
+              <w:spacing w:after="20" w:line="240"/>
+              <w:jc w:val="left"/>
+            </w:pPr>
+            <w:r>
+              <w:rPr>
+                <w:rFonts w:ascii="Times New Roman" w:cs="Times New Roman" w:eastAsia="Times New Roman" w:hAnsi="Times New Roman"/>
+                <w:sz w:val="19"/>
+                <w:szCs w:val="19"/>
+              </w:rPr>
+              <w:t xml:space="preserve">RNF-11</w:t>
+            </w:r>
+          </w:p>
+        </w:tc>
+        <w:tc>
+          <w:tcPr>
+            <w:tcW w:type="dxa" w:w="2560"/>
+            <w:tcMar>
+              <w:top w:type="dxa" w:w="30"/>
+              <w:left w:type="dxa" w:w="70"/>
+              <w:bottom w:type="dxa" w:w="30"/>
+              <w:right w:type="dxa" w:w="70"/>
+            </w:tcMar>
+            <w:vAlign w:val="center"/>
+          </w:tcPr>
+          <w:p>
+            <w:pPr>
+              <w:spacing w:after="20" w:line="240"/>
+              <w:jc w:val="left"/>
+            </w:pPr>
+            <w:r>
+              <w:rPr>
+                <w:rFonts w:ascii="Times New Roman" w:cs="Times New Roman" w:eastAsia="Times New Roman" w:hAnsi="Times New Roman"/>
+                <w:sz w:val="19"/>
+                <w:szCs w:val="19"/>
+              </w:rPr>
+              <w:t xml:space="preserve">Usabilidad — satisfacción (SUS)</w:t>
+            </w:r>
+          </w:p>
+        </w:tc>
+        <w:tc>
+          <w:tcPr>
+            <w:tcW w:type="dxa" w:w="5250"/>
+            <w:tcMar>
+              <w:top w:type="dxa" w:w="30"/>
+              <w:left w:type="dxa" w:w="70"/>
+              <w:bottom w:type="dxa" w:w="30"/>
+              <w:right w:type="dxa" w:w="70"/>
+            </w:tcMar>
+            <w:vAlign w:val="center"/>
+          </w:tcPr>
+          <w:p>
+            <w:pPr>
+              <w:spacing w:after="20" w:line="240"/>
+              <w:jc w:val="left"/>
+            </w:pPr>
+            <w:r>
+              <w:rPr>
+                <w:rFonts w:ascii="Times New Roman" w:cs="Times New Roman" w:eastAsia="Times New Roman" w:hAnsi="Times New Roman"/>
+                <w:sz w:val="19"/>
+                <w:szCs w:val="19"/>
+              </w:rPr>
+              <w:t xml:space="preserve">Diseño de interfaces (Figuras 13 a 16).</w:t>
+            </w:r>
+          </w:p>
+        </w:tc>
+      </w:tr>
+      <w:tr>
+        <w:tc>
+          <w:tcPr>
+            <w:tcW w:type="dxa" w:w="1550"/>
+            <w:shd w:fill="F2F2F2" w:color="auto" w:val="clear"/>
+            <w:tcMar>
+              <w:top w:type="dxa" w:w="30"/>
+              <w:left w:type="dxa" w:w="70"/>
+              <w:bottom w:type="dxa" w:w="30"/>
+              <w:right w:type="dxa" w:w="70"/>
+            </w:tcMar>
+            <w:vAlign w:val="center"/>
+          </w:tcPr>
+          <w:p>
+            <w:pPr>
+              <w:spacing w:after="20" w:line="240"/>
+              <w:jc w:val="left"/>
+            </w:pPr>
+            <w:r>
+              <w:rPr>
+                <w:rFonts w:ascii="Times New Roman" w:cs="Times New Roman" w:eastAsia="Times New Roman" w:hAnsi="Times New Roman"/>
+                <w:sz w:val="19"/>
+                <w:szCs w:val="19"/>
+              </w:rPr>
+              <w:t xml:space="preserve">RNF-12</w:t>
+            </w:r>
+          </w:p>
+        </w:tc>
+        <w:tc>
+          <w:tcPr>
+            <w:tcW w:type="dxa" w:w="2560"/>
+            <w:shd w:fill="F2F2F2" w:color="auto" w:val="clear"/>
+            <w:tcMar>
+              <w:top w:type="dxa" w:w="30"/>
+              <w:left w:type="dxa" w:w="70"/>
+              <w:bottom w:type="dxa" w:w="30"/>
+              <w:right w:type="dxa" w:w="70"/>
+            </w:tcMar>
+            <w:vAlign w:val="center"/>
+          </w:tcPr>
+          <w:p>
+            <w:pPr>
+              <w:spacing w:after="20" w:line="240"/>
+              <w:jc w:val="left"/>
+            </w:pPr>
+            <w:r>
+              <w:rPr>
+                <w:rFonts w:ascii="Times New Roman" w:cs="Times New Roman" w:eastAsia="Times New Roman" w:hAnsi="Times New Roman"/>
+                <w:sz w:val="19"/>
+                <w:szCs w:val="19"/>
+              </w:rPr>
+              <w:t xml:space="preserve">Confiabilidad — desempeño del modelo</w:t>
+            </w:r>
+          </w:p>
+        </w:tc>
+        <w:tc>
+          <w:tcPr>
+            <w:tcW w:type="dxa" w:w="5250"/>
+            <w:shd w:fill="F2F2F2" w:color="auto" w:val="clear"/>
+            <w:tcMar>
+              <w:top w:type="dxa" w:w="30"/>
+              <w:left w:type="dxa" w:w="70"/>
+              <w:bottom w:type="dxa" w:w="30"/>
+              <w:right w:type="dxa" w:w="70"/>
+            </w:tcMar>
+            <w:vAlign w:val="center"/>
+          </w:tcPr>
+          <w:p>
+            <w:pPr>
+              <w:spacing w:after="20" w:line="240"/>
+              <w:jc w:val="left"/>
+            </w:pPr>
+            <w:r>
+              <w:rPr>
+                <w:rFonts w:ascii="Times New Roman" w:cs="Times New Roman" w:eastAsia="Times New Roman" w:hAnsi="Times New Roman"/>
+                <w:sz w:val="19"/>
+                <w:szCs w:val="19"/>
+              </w:rPr>
+              <w:t xml:space="preserve">Componente Servicio predictivo (Figura 12); diagrama de estados de riesgo (Figura 8).</w:t>
+            </w:r>
+          </w:p>
+        </w:tc>
+      </w:tr>
+      <w:tr>
+        <w:tc>
+          <w:tcPr>
+            <w:tcW w:type="dxa" w:w="1550"/>
+            <w:tcMar>
+              <w:top w:type="dxa" w:w="30"/>
+              <w:left w:type="dxa" w:w="70"/>
+              <w:bottom w:type="dxa" w:w="30"/>
+              <w:right w:type="dxa" w:w="70"/>
+            </w:tcMar>
+            <w:vAlign w:val="center"/>
+          </w:tcPr>
+          <w:p>
+            <w:pPr>
+              <w:spacing w:after="20" w:line="240"/>
+              <w:jc w:val="left"/>
+            </w:pPr>
+            <w:r>
+              <w:rPr>
+                <w:rFonts w:ascii="Times New Roman" w:cs="Times New Roman" w:eastAsia="Times New Roman" w:hAnsi="Times New Roman"/>
+                <w:sz w:val="19"/>
+                <w:szCs w:val="19"/>
+              </w:rPr>
               <w:t xml:space="preserve">RNF-13</w:t>
             </w:r>
           </w:p>
         </w:tc>
         <w:tc>
           <w:tcPr>
-            <w:tcW w:type="dxa" w:w="2760"/>
+            <w:tcW w:type="dxa" w:w="2560"/>
+            <w:tcMar>
+              <w:top w:type="dxa" w:w="30"/>
+              <w:left w:type="dxa" w:w="70"/>
+              <w:bottom w:type="dxa" w:w="30"/>
+              <w:right w:type="dxa" w:w="70"/>
+            </w:tcMar>
+            <w:vAlign w:val="center"/>
+          </w:tcPr>
+          <w:p>
+            <w:pPr>
+              <w:spacing w:after="20" w:line="240"/>
+              <w:jc w:val="left"/>
+            </w:pPr>
+            <w:r>
+              <w:rPr>
+                <w:rFonts w:ascii="Times New Roman" w:cs="Times New Roman" w:eastAsia="Times New Roman" w:hAnsi="Times New Roman"/>
+                <w:sz w:val="19"/>
+                <w:szCs w:val="19"/>
+              </w:rPr>
+              <w:t xml:space="preserve">Confiabilidad — integridad de la información</w:t>
+            </w:r>
+          </w:p>
+        </w:tc>
+        <w:tc>
+          <w:tcPr>
+            <w:tcW w:type="dxa" w:w="5250"/>
+            <w:tcMar>
+              <w:top w:type="dxa" w:w="30"/>
+              <w:left w:type="dxa" w:w="70"/>
+              <w:bottom w:type="dxa" w:w="30"/>
+              <w:right w:type="dxa" w:w="70"/>
+            </w:tcMar>
+            <w:vAlign w:val="center"/>
+          </w:tcPr>
+          <w:p>
+            <w:pPr>
+              <w:spacing w:after="20" w:line="240"/>
+              <w:jc w:val="left"/>
+            </w:pPr>
+            <w:r>
+              <w:rPr>
+                <w:rFonts w:ascii="Times New Roman" w:cs="Times New Roman" w:eastAsia="Times New Roman" w:hAnsi="Times New Roman"/>
+                <w:sz w:val="19"/>
+                <w:szCs w:val="19"/>
+              </w:rPr>
+              <w:t xml:space="preserve">Diseño de seguridad (Figura 17); modelo entidad-relación (Figura 10).</w:t>
+            </w:r>
+          </w:p>
+        </w:tc>
+      </w:tr>
+      <w:tr>
+        <w:tc>
+          <w:tcPr>
+            <w:tcW w:type="dxa" w:w="1550"/>
             <w:shd w:fill="F2F2F2" w:color="auto" w:val="clear"/>
             <w:tcMar>
               <w:top w:type="dxa" w:w="30"/>
@@ -7998,13 +8786,13 @@
                 <w:sz w:val="19"/>
                 <w:szCs w:val="19"/>
               </w:rPr>
-              <w:t xml:space="preserve">Integridad de la información</w:t>
-            </w:r>
-          </w:p>
-        </w:tc>
-        <w:tc>
-          <w:tcPr>
-            <w:tcW w:type="dxa" w:w="4500"/>
+              <w:t xml:space="preserve">RNF-14</w:t>
+            </w:r>
+          </w:p>
+        </w:tc>
+        <w:tc>
+          <w:tcPr>
+            <w:tcW w:type="dxa" w:w="2560"/>
             <w:shd w:fill="F2F2F2" w:color="auto" w:val="clear"/>
             <w:tcMar>
               <w:top w:type="dxa" w:w="30"/>
@@ -8025,7 +8813,114 @@
                 <w:sz w:val="19"/>
                 <w:szCs w:val="19"/>
               </w:rPr>
-              <w:t xml:space="preserve">Servicio de respaldos del diseño de seguridad (Fig. 17); modelo entidad-relación (Fig. 10).</w:t>
+              <w:t xml:space="preserve">Mantenibilidad — trazabilidad (bitácora)</w:t>
+            </w:r>
+          </w:p>
+        </w:tc>
+        <w:tc>
+          <w:tcPr>
+            <w:tcW w:type="dxa" w:w="5250"/>
+            <w:shd w:fill="F2F2F2" w:color="auto" w:val="clear"/>
+            <w:tcMar>
+              <w:top w:type="dxa" w:w="30"/>
+              <w:left w:type="dxa" w:w="70"/>
+              <w:bottom w:type="dxa" w:w="30"/>
+              <w:right w:type="dxa" w:w="70"/>
+            </w:tcMar>
+            <w:vAlign w:val="center"/>
+          </w:tcPr>
+          <w:p>
+            <w:pPr>
+              <w:spacing w:after="20" w:line="240"/>
+              <w:jc w:val="left"/>
+            </w:pPr>
+            <w:r>
+              <w:rPr>
+                <w:rFonts w:ascii="Times New Roman" w:cs="Times New Roman" w:eastAsia="Times New Roman" w:hAnsi="Times New Roman"/>
+                <w:sz w:val="19"/>
+                <w:szCs w:val="19"/>
+              </w:rPr>
+              <w:t xml:space="preserve">Diseño de seguridad (Figura 17); entidad Bitácora del modelo entidad-relación (Figura 10).</w:t>
+            </w:r>
+          </w:p>
+        </w:tc>
+      </w:tr>
+      <w:tr>
+        <w:tc>
+          <w:tcPr>
+            <w:tcW w:type="dxa" w:w="1550"/>
+            <w:tcMar>
+              <w:top w:type="dxa" w:w="30"/>
+              <w:left w:type="dxa" w:w="70"/>
+              <w:bottom w:type="dxa" w:w="30"/>
+              <w:right w:type="dxa" w:w="70"/>
+            </w:tcMar>
+            <w:vAlign w:val="center"/>
+          </w:tcPr>
+          <w:p>
+            <w:pPr>
+              <w:spacing w:after="20" w:line="240"/>
+              <w:jc w:val="left"/>
+            </w:pPr>
+            <w:r>
+              <w:rPr>
+                <w:rFonts w:ascii="Times New Roman" w:cs="Times New Roman" w:eastAsia="Times New Roman" w:hAnsi="Times New Roman"/>
+                <w:sz w:val="19"/>
+                <w:szCs w:val="19"/>
+              </w:rPr>
+              <w:t xml:space="preserve">RNF-15</w:t>
+            </w:r>
+          </w:p>
+        </w:tc>
+        <w:tc>
+          <w:tcPr>
+            <w:tcW w:type="dxa" w:w="2560"/>
+            <w:tcMar>
+              <w:top w:type="dxa" w:w="30"/>
+              <w:left w:type="dxa" w:w="70"/>
+              <w:bottom w:type="dxa" w:w="30"/>
+              <w:right w:type="dxa" w:w="70"/>
+            </w:tcMar>
+            <w:vAlign w:val="center"/>
+          </w:tcPr>
+          <w:p>
+            <w:pPr>
+              <w:spacing w:after="20" w:line="240"/>
+              <w:jc w:val="left"/>
+            </w:pPr>
+            <w:r>
+              <w:rPr>
+                <w:rFonts w:ascii="Times New Roman" w:cs="Times New Roman" w:eastAsia="Times New Roman" w:hAnsi="Times New Roman"/>
+                <w:sz w:val="19"/>
+                <w:szCs w:val="19"/>
+              </w:rPr>
+              <w:t xml:space="preserve">Compatibilidad — navegadores</w:t>
+            </w:r>
+          </w:p>
+        </w:tc>
+        <w:tc>
+          <w:tcPr>
+            <w:tcW w:type="dxa" w:w="5250"/>
+            <w:tcMar>
+              <w:top w:type="dxa" w:w="30"/>
+              <w:left w:type="dxa" w:w="70"/>
+              <w:bottom w:type="dxa" w:w="30"/>
+              <w:right w:type="dxa" w:w="70"/>
+            </w:tcMar>
+            <w:vAlign w:val="center"/>
+          </w:tcPr>
+          <w:p>
+            <w:pPr>
+              <w:spacing w:after="20" w:line="240"/>
+              <w:jc w:val="left"/>
+            </w:pPr>
+            <w:r>
+              <w:rPr>
+                <w:rFonts w:ascii="Times New Roman" w:cs="Times New Roman" w:eastAsia="Times New Roman" w:hAnsi="Times New Roman"/>
+                <w:sz w:val="19"/>
+                <w:szCs w:val="19"/>
+              </w:rPr>
+              <w:t xml:space="preserve">Frontend web del diagrama de componentes (Figura 12); diseño de interfaces (Figuras 13 a 16).</w:t>
             </w:r>
           </w:p>
         </w:tc>
@@ -8071,7 +8966,7 @@
           <w:sz w:val="24"/>
           <w:szCs w:val="24"/>
         </w:rPr>
-        <w:t xml:space="preserve">La correspondencia presentada confirma que los elementos de diseño responden a los requerimientos y casos de uso definidos en el Capítulo IV, lo que completa de manera coherente el diseño de la solución propuesta para Server Guatemala y sienta las bases para su posterior desarrollo e implementación.</w:t>
+        <w:t xml:space="preserve">La correspondencia presentada confirma que la totalidad de los requerimientos definidos en el Capítulo IV se encuentra representada en el diseño de la solución, lo que completa de manera coherente el diseño propuesto para Server Guatemala y sienta las bases para su posterior desarrollo e implementación.</w:t>
       </w:r>
     </w:p>
     <w:sectPr>

</xml_diff>